<commit_message>
Quitar el registro de prompts y dejar solo la entrega.
</commit_message>
<xml_diff>
--- a/ENTREGA.docx
+++ b/ENTREGA.docx
@@ -802,138 +802,6 @@
           <w:sz w:val="24"/>
           <w:sz-cs w:val="24"/>
         </w:rPr>
-        <w:t xml:space="preserve">## Registro de prompts</w:t>
-      </w:r>
-    </w:p>
-    <w:p>
-      <w:pPr/>
-      <w:r>
-        <w:rPr>
-          <w:rFonts w:ascii="Helvetica Light" w:hAnsi="Helvetica Light" w:cs="Helvetica Light"/>
-          <w:sz w:val="24"/>
-          <w:sz-cs w:val="24"/>
-        </w:rPr>
-        <w:t xml:space="preserve"/>
-      </w:r>
-    </w:p>
-    <w:p>
-      <w:pPr/>
-      <w:r>
-        <w:rPr>
-          <w:rFonts w:ascii="Helvetica Light" w:hAnsi="Helvetica Light" w:cs="Helvetica Light"/>
-          <w:sz w:val="24"/>
-          <w:sz-cs w:val="24"/>
-        </w:rPr>
-        <w:t xml:space="preserve">| Prompt | Aporte | Decisión |</w:t>
-      </w:r>
-    </w:p>
-    <w:p>
-      <w:pPr/>
-      <w:r>
-        <w:rPr>
-          <w:rFonts w:ascii="Helvetica Light" w:hAnsi="Helvetica Light" w:cs="Helvetica Light"/>
-          <w:sz w:val="24"/>
-          <w:sz-cs w:val="24"/>
-        </w:rPr>
-        <w:t xml:space="preserve">|--------|--------|----------|</w:t>
-      </w:r>
-    </w:p>
-    <w:p>
-      <w:pPr/>
-      <w:r>
-        <w:rPr>
-          <w:rFonts w:ascii="Helvetica Light" w:hAnsi="Helvetica Light" w:cs="Helvetica Light"/>
-          <w:sz w:val="24"/>
-          <w:sz-cs w:val="24"/>
-        </w:rPr>
-        <w:t xml:space="preserve">| Crear una API REST de tareas en Node.js con crear, listar, actualizar y eliminar. Explicar la estructura antes del código. | Separar servidor, rutas y almacén en memoria. | Se usó `index.js`, `todos.js` y `store.js`. |</w:t>
-      </w:r>
-    </w:p>
-    <w:p>
-      <w:pPr/>
-      <w:r>
-        <w:rPr>
-          <w:rFonts w:ascii="Helvetica Light" w:hAnsi="Helvetica Light" w:cs="Helvetica Light"/>
-          <w:sz w:val="24"/>
-          <w:sz-cs w:val="24"/>
-        </w:rPr>
-        <w:t xml:space="preserve">| Qué problemas de calidad detectaría Sonar en este código. | Falta de validación y errores inconsistentes. | Se validó la entrada y se unificaron los códigos HTTP. |</w:t>
-      </w:r>
-    </w:p>
-    <w:p>
-      <w:pPr/>
-      <w:r>
-        <w:rPr>
-          <w:rFonts w:ascii="Helvetica Light" w:hAnsi="Helvetica Light" w:cs="Helvetica Light"/>
-          <w:sz w:val="24"/>
-          <w:sz-cs w:val="24"/>
-        </w:rPr>
-        <w:t xml:space="preserve">| Dockerfile sencillo y seguro. | Alpine, `npm ci`, usuario no root. | Build de dos etapas, `appuser` y `HEALTHCHECK`. |</w:t>
-      </w:r>
-    </w:p>
-    <w:p>
-      <w:pPr/>
-      <w:r>
-        <w:rPr>
-          <w:rFonts w:ascii="Helvetica Light" w:hAnsi="Helvetica Light" w:cs="Helvetica Light"/>
-          <w:sz w:val="24"/>
-          <w:sz-cs w:val="24"/>
-        </w:rPr>
-        <w:t xml:space="preserve">| Revisar si el README basta para ejecutar la aplicación. | Faltaban ejemplos de `curl` y el comando Docker. | Se completó el README. |</w:t>
-      </w:r>
-    </w:p>
-    <w:p>
-      <w:pPr/>
-      <w:r>
-        <w:rPr>
-          <w:rFonts w:ascii="Helvetica Light" w:hAnsi="Helvetica Light" w:cs="Helvetica Light"/>
-          <w:sz w:val="24"/>
-          <w:sz-cs w:val="24"/>
-        </w:rPr>
-        <w:t xml:space="preserve">| Trivy reporta HIGH/CRITICAL en la imagen base. | El riesgo está en paquetes del SO y en npm de Node. | Se actualizó la base y se volvió a escanear. |</w:t>
-      </w:r>
-    </w:p>
-    <w:p>
-      <w:pPr/>
-      <w:r>
-        <w:rPr>
-          <w:rFonts w:ascii="Helvetica Light" w:hAnsi="Helvetica Light" w:cs="Helvetica Light"/>
-          <w:sz w:val="24"/>
-          <w:sz-cs w:val="24"/>
-        </w:rPr>
-        <w:t xml:space="preserve"/>
-      </w:r>
-    </w:p>
-    <w:p>
-      <w:pPr/>
-      <w:r>
-        <w:rPr>
-          <w:rFonts w:ascii="Helvetica Light" w:hAnsi="Helvetica Light" w:cs="Helvetica Light"/>
-          <w:sz w:val="24"/>
-          <w:sz-cs w:val="24"/>
-        </w:rPr>
-        <w:t xml:space="preserve">Decisión técnica: no usar `node:latest`.</w:t>
-      </w:r>
-    </w:p>
-    <w:p>
-      <w:pPr/>
-      <w:r>
-        <w:rPr>
-          <w:rFonts w:ascii="Helvetica Light" w:hAnsi="Helvetica Light" w:cs="Helvetica Light"/>
-          <w:sz w:val="24"/>
-          <w:sz-cs w:val="24"/>
-        </w:rPr>
-        <w:t xml:space="preserve"/>
-      </w:r>
-    </w:p>
-    <w:p>
-      <w:pPr/>
-      <w:r>
-        <w:rPr>
-          <w:rFonts w:ascii="Helvetica Light" w:hAnsi="Helvetica Light" w:cs="Helvetica Light"/>
-          <w:sz w:val="24"/>
-          <w:sz-cs w:val="24"/>
-        </w:rPr>
         <w:t xml:space="preserve">## Reflexión</w:t>
       </w:r>
     </w:p>
@@ -956,7 +824,7 @@
           <w:sz w:val="24"/>
           <w:sz-cs w:val="24"/>
         </w:rPr>
-        <w:t xml:space="preserve">El problema no fue el CRUD, sino cerrar el flujo hasta una imagen publicada y revisada. El código aceptaba datos inválidos; se corrigió la validación y el manejo de errores. Sonar señaló la cabecera `X-Powered-By` y se deshabilitó. Docker exigió usuario no root y no copiar `node_modules` del host. Trivy mostró que la seguridad depende de la imagen base: se actualizó Alpine y se quitó npm del runtime. El artefacto que se escanea es el mismo que está en Docker Hub con la etiqueta `1.0`.</w:t>
+        <w:t xml:space="preserve">El problema no fue el CRUD, sino cerrar el flujo hasta una imagen publicada y revisada. El código aceptaba datos inválidos; se corrigió la validación y el manejo de errores. Sonar señaló la cabecera X-Powered-By y se deshabilitó. Docker exigió usuario no root y no copiar node_modules del host. Trivy mostró que la seguridad depende de la imagen base: se actualizó Alpine y se quitó npm del runtime. El artefacto que se escanea es el mismo que está en Docker Hub con la etiqueta 1.0.</w:t>
       </w:r>
     </w:p>
     <w:sectPr/>

</xml_diff>